<commit_message>
Add quarter-end ramp variant and update the report
compare.py now runs V1+ramp (V1 plus the day of month in March, June,
September and December), so the report's ramp numbers come from the
repo, and prints the monthly error for every variant. The report splits
the weight issues into three rows and states that the quote_signal
correlations are on clean rows.

Co-Authored-By: Claude Opus 5.5 <noreply@anthropic.com>
</commit_message>
<xml_diff>
--- a/reports/report.docx
+++ b/reports/report.docx
@@ -167,7 +167,7 @@
               <w:rPr>
                 <w:b w:val="0"/>
               </w:rPr>
-              <w:t>Weight: sign flipped, at the 47,500 lbs cap, missing</w:t>
+              <w:t>Weight sign flipped (negative)</w:t>
             </w:r>
           </w:p>
         </w:tc>
@@ -180,7 +180,7 @@
               <w:rPr>
                 <w:b w:val="0"/>
               </w:rPr>
-              <w:t>292 / 145, 1,204 / 301, 300 / 165</w:t>
+              <w:t>292 / 145</w:t>
             </w:r>
           </w:p>
         </w:tc>
@@ -193,7 +193,89 @@
               <w:rPr>
                 <w:b w:val="0"/>
               </w:rPr>
-              <w:t>abs(); keep the cap value with a flag; fill with the training median per equipment (~31,500 lbs) with a flag</w:t>
+              <w:t>abs()</w:t>
+            </w:r>
+          </w:p>
+        </w:tc>
+      </w:tr>
+      <w:tr>
+        <w:tc>
+          <w:tcPr>
+            <w:tcW w:type="dxa" w:w="3120"/>
+          </w:tcPr>
+          <w:p>
+            <w:r>
+              <w:rPr>
+                <w:b w:val="0"/>
+              </w:rPr>
+              <w:t>Weight at the 47,500 lbs cap</w:t>
+            </w:r>
+          </w:p>
+        </w:tc>
+        <w:tc>
+          <w:tcPr>
+            <w:tcW w:type="dxa" w:w="3120"/>
+          </w:tcPr>
+          <w:p>
+            <w:r>
+              <w:rPr>
+                <w:b w:val="0"/>
+              </w:rPr>
+              <w:t>1,204 / 301</w:t>
+            </w:r>
+          </w:p>
+        </w:tc>
+        <w:tc>
+          <w:tcPr>
+            <w:tcW w:type="dxa" w:w="3120"/>
+          </w:tcPr>
+          <w:p>
+            <w:r>
+              <w:rPr>
+                <w:b w:val="0"/>
+              </w:rPr>
+              <w:t>Kept at 47,500, with a flag</w:t>
+            </w:r>
+          </w:p>
+        </w:tc>
+      </w:tr>
+      <w:tr>
+        <w:tc>
+          <w:tcPr>
+            <w:tcW w:type="dxa" w:w="3120"/>
+          </w:tcPr>
+          <w:p>
+            <w:r>
+              <w:rPr>
+                <w:b w:val="0"/>
+              </w:rPr>
+              <w:t>Weight missing</w:t>
+            </w:r>
+          </w:p>
+        </w:tc>
+        <w:tc>
+          <w:tcPr>
+            <w:tcW w:type="dxa" w:w="3120"/>
+          </w:tcPr>
+          <w:p>
+            <w:r>
+              <w:rPr>
+                <w:b w:val="0"/>
+              </w:rPr>
+              <w:t>300 / 165</w:t>
+            </w:r>
+          </w:p>
+        </w:tc>
+        <w:tc>
+          <w:tcPr>
+            <w:tcW w:type="dxa" w:w="3120"/>
+          </w:tcPr>
+          <w:p>
+            <w:r>
+              <w:rPr>
+                <w:b w:val="0"/>
+              </w:rPr>
+              <w:t>Training median per equipment (~31,500 lbs), with a flag</w:t>
             </w:r>
           </w:p>
         </w:tc>
@@ -360,7 +442,7 @@
         <w:rPr>
           <w:b w:val="0"/>
         </w:rPr>
-        <w:t xml:space="preserve"> In January, February, March, June and September it is almost exactly the rate per mile (correlation +1.00); in April, May, July and October it is mirrored (about 4.15 minus the rate per mile, -0.99); in August it is unrelated (-0.02). November and December look like August: its correlation with distance is 0.02 and 0.01, against about ±0.7 in every other month. On an August test, a model using it had 5.2% error against 2.2% without it.</w:t>
+        <w:t xml:space="preserve"> On clean rows, it is almost exactly the rate per mile in January, February, March, June and September (correlation +1.00), mirrored in April, May, July and October (about 4.15 minus the rate per mile, correlation -0.99), and unrelated in August (-0.02). November and December look like August: its correlation with distance is 0.02 and 0.01, against about ±0.7 in every other month. On an August test, a model using it had 5.2% error against 2.2% without it.</w:t>
       </w:r>
     </w:p>
     <w:p>
@@ -419,7 +501,7 @@
         <w:rPr>
           <w:b w:val="0"/>
         </w:rPr>
-        <w:t>The baseline predicts the training median rate per mile for the load's distance band and equipment, times distance. The model is LightGBM on log(rate) with fixed settings (600 trees, learning rate 0.05, 31 leaves, at least 50 loads per leaf); L1 loss and smaller trees were no better. Four feature sets were compared:</w:t>
+        <w:t>The baseline predicts the training median rate per mile for the load's distance band and equipment, times distance. The model is LightGBM on log(rate) with fixed settings (600 trees, learning rate 0.05, 31 leaves, at least 50 loads per leaf); L1 loss and smaller trees were no better. Five feature sets were compared:</w:t>
       </w:r>
     </w:p>
     <w:p>
@@ -464,6 +546,17 @@
           <w:b w:val="0"/>
         </w:rPr>
         <w:t>V3: V2 + market_index</w:t>
+      </w:r>
+    </w:p>
+    <w:p>
+      <w:pPr>
+        <w:pStyle w:val="ListBullet"/>
+      </w:pPr>
+      <w:r>
+        <w:rPr>
+          <w:b w:val="0"/>
+        </w:rPr>
+        <w:t>V1+ramp: V1 + day of month in March, June, September and December (0 in other months)</w:t>
       </w:r>
     </w:p>
     <w:tbl>
@@ -981,6 +1074,73 @@
           </w:p>
         </w:tc>
       </w:tr>
+      <w:tr>
+        <w:tc>
+          <w:tcPr>
+            <w:tcW w:type="dxa" w:w="1872"/>
+          </w:tcPr>
+          <w:p>
+            <w:r>
+              <w:rPr>
+                <w:b w:val="0"/>
+              </w:rPr>
+              <w:t>V1+ramp</w:t>
+            </w:r>
+          </w:p>
+        </w:tc>
+        <w:tc>
+          <w:tcPr>
+            <w:tcW w:type="dxa" w:w="1872"/>
+          </w:tcPr>
+          <w:p>
+            <w:r>
+              <w:rPr>
+                <w:b w:val="0"/>
+              </w:rPr>
+              <w:t>2.65%</w:t>
+            </w:r>
+          </w:p>
+        </w:tc>
+        <w:tc>
+          <w:tcPr>
+            <w:tcW w:type="dxa" w:w="1872"/>
+          </w:tcPr>
+          <w:p>
+            <w:r>
+              <w:rPr>
+                <w:b w:val="0"/>
+              </w:rPr>
+              <w:t>2.26%</w:t>
+            </w:r>
+          </w:p>
+        </w:tc>
+        <w:tc>
+          <w:tcPr>
+            <w:tcW w:type="dxa" w:w="1872"/>
+          </w:tcPr>
+          <w:p>
+            <w:r>
+              <w:rPr>
+                <w:b w:val="0"/>
+              </w:rPr>
+              <w:t>4.88%</w:t>
+            </w:r>
+          </w:p>
+        </w:tc>
+        <w:tc>
+          <w:tcPr>
+            <w:tcW w:type="dxa" w:w="1872"/>
+          </w:tcPr>
+          <w:p>
+            <w:r>
+              <w:rPr>
+                <w:b w:val="0"/>
+              </w:rPr>
+              <w:t>4.78%</w:t>
+            </w:r>
+          </w:p>
+        </w:tc>
+      </w:tr>
     </w:tbl>
     <w:p>
       <w:r>
@@ -1039,7 +1199,7 @@
         <w:rPr>
           <w:b w:val="0"/>
         </w:rPr>
-        <w:t>Every attempt to model change over time made things worse. Quarter features (V2) learned the levels of the few training quarters, not a repeating pattern (fold B: September 3.5% too high, October 4.9% too low). Raw market_index (V3) is confounded with the season (October 5.2% too low). Weighting recent loads more (half-lives of 30, 60, 90 days) was worse on fold A and gained at most 0.08 points on fold B, below the 0.1-point bar set in advance. A quarter-end ramp feature was worse on both folds (by 0.40 and 0.37 points).</w:t>
+        <w:t>Every attempt to model change over time made things worse. Quarter features (V2) learned the levels of the few training quarters, not a repeating pattern (fold B: September 3.5% too high, October 4.9% too low). Raw market_index (V3) is confounded with the season (October 5.2% too low). Weighting recent loads more (half-lives of 30, 60, 90 days) was worse on fold A and gained at most 0.08 points on fold B, below the 0.1-point bar set in advance. The quarter-end ramp (V1+ramp) was worse on both folds (2.65% and 2.26%, against 2.26% and 1.91% for V1) and over-predicted September by 1.8%.</w:t>
       </w:r>
     </w:p>
     <w:p>

</xml_diff>

<commit_message>
Compute every report number in the repo scripts
compare.py adds the quote_signal check (V1 with and without it, trained
on Jan-Jul and tested on August, with fold B for contrast) and the share
of test days where V1 beats V0. explore.py adds the monthly rate level
adjusted for distance and equipment, the climb within each month, and
the constant that quote_signal mirrors around. Folds are now passed to
split() as month lists, so the August test uses the same pipeline. The
report quotes the new quote_signal and quarter-end numbers.

Co-Authored-By: Claude Opus 5.5 <noreply@anthropic.com>
</commit_message>
<xml_diff>
--- a/reports/report.docx
+++ b/reports/report.docx
@@ -442,7 +442,7 @@
         <w:rPr>
           <w:b w:val="0"/>
         </w:rPr>
-        <w:t xml:space="preserve"> On clean rows, it is almost exactly the rate per mile in January, February, March, June and September (correlation +1.00), mirrored in April, May, July and October (about 4.15 minus the rate per mile, correlation -0.99), and unrelated in August (-0.02). November and December look like August: its correlation with distance is 0.02 and 0.01, against about ±0.7 in every other month. On an August test, a model using it had 5.2% error against 2.2% without it.</w:t>
+        <w:t xml:space="preserve"> On clean rows, it is almost exactly the rate per mile in January, February, March, June and September (correlation +1.00), mirrored in April, May, July and October (about 4.15 minus the rate per mile, correlation -0.99), and unrelated in August (-0.02). November and December look like August: its correlation with distance is 0.02 and 0.01, against about ±0.7 in every other month. Trained on January-July and tested on August, V1 with quote_signal has 4.65% clean MAPE against 1.82% without it; on fold B, where it carries the rate, it would help (1.49% against 1.91%).</w:t>
       </w:r>
     </w:p>
     <w:p>
@@ -1267,7 +1267,7 @@
         <w:rPr>
           <w:b w:val="0"/>
         </w:rPr>
-        <w:t>The main known limitation: rates climbed about 3-4% through March, June and September, then dropped when the next quarter started. December also ends a quarter, but no feature tested could learn this from three quarters of history, so late-December predictions may be 2-4% low.</w:t>
+        <w:t>The main known limitation: rates climbed 4.5%, 3.3% and 2.8% through March, June and September (last week against first week), then dropped 3.3%, 3.7% and 2.0% when the next quarter started. December also ends a quarter, but no feature tested could learn this from three quarters of history, so late-December predictions may be 2-4% low.</w:t>
       </w:r>
     </w:p>
     <w:p>

</xml_diff>